<commit_message>
Add FOP entity and DYuSSh 26 reference to tender brief
</commit_message>
<xml_diff>
--- a/Бриф_тендер.docx
+++ b/Бриф_тендер.docx
@@ -13,6 +13,18 @@
           <w:sz w:val="44"/>
         </w:rPr>
         <w:t>FOOTBALLSHOP.COM.UA</w:t>
+      </w:r>
+    </w:p>
+    <w:p>
+      <w:pPr>
+        <w:jc w:val="center"/>
+      </w:pPr>
+      <w:r>
+        <w:rPr>
+          <w:b/>
+          <w:sz w:val="26"/>
+        </w:rPr>
+        <w:t>ФОП Мельничук Іван Романович</w:t>
       </w:r>
     </w:p>
     <w:p>
@@ -44,7 +56,7 @@
           <w:b w:val="0"/>
           <w:i w:val="0"/>
         </w:rPr>
-        <w:t>Footballshop.com.ua — спеціалізований інтернет-магазин футбольних та спортивних товарів (м. Київ). Працюємо у ніші футбольної екіпіровки та інвентарю, обслуговуємо як роздрібних покупців, так і команди, клуби, школи й організації.</w:t>
+        <w:t>Footballshop.com.ua — спеціалізований інтернет-магазин футбольних та спортивних товарів (м. Київ). Господарську діяльність веде ФОП Мельничук Іван Романович. Працюємо у ніші футбольної екіпіровки та інвентарю, обслуговуємо як роздрібних покупців, так і команди, клуби, школи й організації.</w:t>
       </w:r>
     </w:p>
     <w:p>
@@ -170,7 +182,28 @@
           <w:b/>
           <w:i w:val="0"/>
         </w:rPr>
-        <w:t>Конкретні приклади закупівель (заповнити перед зустріччю):</w:t>
+        <w:t>Конкретні приклади закупівель:</w:t>
+      </w:r>
+    </w:p>
+    <w:p>
+      <w:pPr>
+        <w:pStyle w:val="ListBullet"/>
+      </w:pPr>
+      <w:r>
+        <w:rPr>
+          <w:b/>
+        </w:rPr>
+        <w:t>ДЮСШ №26, м. Київ</w:t>
+      </w:r>
+      <w:r>
+        <w:t xml:space="preserve"> — постачання спортивних товарів (футбольна форма / м'ячі / інвентар). </w:t>
+      </w:r>
+      <w:r>
+        <w:rPr>
+          <w:i/>
+          <w:color w:val="C00000"/>
+        </w:rPr>
+        <w:t>[Вписати: рік, предмет постачання, суму договору, номер закупівлі якщо через Prozorro]</w:t>
       </w:r>
     </w:p>
     <w:p>
@@ -182,19 +215,7 @@
           <w:i/>
           <w:color w:val="C00000"/>
         </w:rPr>
-        <w:t>[Рік, замовник, предмет закупівлі, сума, результат — напр.: «2025, ДЮСШ №__, м'ячі SELECT ___ шт., ___ грн, договір виконано»]</w:t>
-      </w:r>
-    </w:p>
-    <w:p>
-      <w:pPr>
-        <w:pStyle w:val="ListBullet"/>
-      </w:pPr>
-      <w:r>
-        <w:rPr>
-          <w:i/>
-          <w:color w:val="C00000"/>
-        </w:rPr>
-        <w:t>[Номер закупівлі в Prozorro (UA-XXXX-XX-XX-XXXXXX-X), якщо участь була через Prozorro]</w:t>
+        <w:t>[Інші замовники: рік, предмет закупівлі, сума, результат]</w:t>
       </w:r>
     </w:p>
     <w:p>
@@ -424,6 +445,35 @@
         <w:gridCol w:w="4873"/>
         <w:gridCol w:w="4873"/>
       </w:tblGrid>
+      <w:tr>
+        <w:tc>
+          <w:tcPr>
+            <w:tcW w:type="dxa" w:w="4873"/>
+          </w:tcPr>
+          <w:p>
+            <w:r>
+              <w:rPr>
+                <w:b/>
+                <w:sz w:val="22"/>
+              </w:rPr>
+              <w:t>Юридична особа (учасник тендеру)</w:t>
+            </w:r>
+          </w:p>
+        </w:tc>
+        <w:tc>
+          <w:tcPr>
+            <w:tcW w:type="dxa" w:w="4873"/>
+          </w:tcPr>
+          <w:p>
+            <w:r>
+              <w:rPr>
+                <w:sz w:val="22"/>
+              </w:rPr>
+              <w:t>ФОП Мельничук Іван Романович</w:t>
+            </w:r>
+          </w:p>
+        </w:tc>
+      </w:tr>
       <w:tr>
         <w:tc>
           <w:tcPr>

</xml_diff>